<commit_message>
Aplica a revisão final: verificador mais preciso e correções bíblicas no livro
Co-Authored-By: Claude Opus 5.5 <noreply@anthropic.com>
Claude-Session: https://claude.ai/code/session_01LzW95iq837pNNELpWoCBLT
</commit_message>
<xml_diff>
--- a/livros/os-dias-de-adao/Os-dias-de-Adao.docx
+++ b/livros/os-dias-de-adao/Os-dias-de-Adao.docx
@@ -800,7 +800,7 @@
         <w:pStyle w:val="BodyText"/>
       </w:pPr>
       <w:r>
-        <w:t xml:space="preserve">E depois soprou. O fôlego de vida é o que faz do barro uma alma vivente. Sem esse sopro, Adão seria apenas uma escultura bonita. Com ele, passou a ser alguém capaz de amar, de conhecer, de responder. Jó entendeu isso quando disse:</w:t>
+        <w:t xml:space="preserve">E depois soprou. O fôlego de vida é o que faz do barro uma alma vivente. Sem esse sopro, Adão seria apenas uma escultura bonita. Com ele, passou a ser alguém capaz de amar, de conhecer, de responder. Eliú, o jovem amigo de Jó, entendeu isso quando disse:</w:t>
       </w:r>
       <w:r>
         <w:t xml:space="preserve"> </w:t>
@@ -868,24 +868,24 @@
         <w:t xml:space="preserve"> </w:t>
       </w:r>
       <w:r>
-        <w:t xml:space="preserve">(Salmos 8:4). A resposta do próprio salmo é surpreendente: Deus o fez</w:t>
-      </w:r>
-      <w:r>
-        <w:t xml:space="preserve"> </w:t>
-      </w:r>
-      <w:r>
-        <w:rPr>
-          <w:iCs/>
-          <w:i/>
-        </w:rPr>
-        <w:t xml:space="preserve">“</w:t>
-      </w:r>
-      <w:r>
-        <w:rPr>
-          <w:iCs/>
-          <w:i/>
-        </w:rPr>
-        <w:t xml:space="preserve">pouco menor do que os anjos e de glória e de honra o coroaste</w:t>
+        <w:t xml:space="preserve">(Salmos 8:4). A resposta do próprio salmo é surpreendente:</w:t>
+      </w:r>
+      <w:r>
+        <w:t xml:space="preserve"> </w:t>
+      </w:r>
+      <w:r>
+        <w:rPr>
+          <w:iCs/>
+          <w:i/>
+        </w:rPr>
+        <w:t xml:space="preserve">“</w:t>
+      </w:r>
+      <w:r>
+        <w:rPr>
+          <w:iCs/>
+          <w:i/>
+        </w:rPr>
+        <w:t xml:space="preserve">Fizeste-o, no entanto, por um pouco, menor do que Deus e de glória e de honra o coroaste</w:t>
       </w:r>
       <w:r>
         <w:rPr>
@@ -1464,7 +1464,7 @@
         <w:pStyle w:val="BodyText"/>
       </w:pPr>
       <w:r>
-        <w:t xml:space="preserve">Não é um animal. Ele soube no primeiro instante. Os olhos dela tinham a mesma coisa que ele tinha visto na água do rio: um rosto que olha de volta, que entende, que responde. Ela não precisava ser nomeada como os animais foram; ele a reconheceu. Era</w:t>
+        <w:t xml:space="preserve">Não é um animal. Ele soube no primeiro instante. Os olhos dela tinham a mesma coisa que ele tinha visto na água do rio: um rosto que olha de volta, que entende, que responde. Ele não a nomeou como fizera com os animais, olhando de fora; ele a reconheceu. Era</w:t>
       </w:r>
       <w:r>
         <w:t xml:space="preserve"> </w:t>
@@ -1854,7 +1854,7 @@
         <w:pStyle w:val="BodyText"/>
       </w:pPr>
       <w:r>
-        <w:t xml:space="preserve">Não foi num jardim florido, mas num túmulo cavado na rocha. E antes desse sono, um soldado romano abriu o seu lado com uma lança,</w:t>
+        <w:t xml:space="preserve">Não foi num jardim florido, mas num túmulo novo, cavado na rocha, num jardim perto do lugar onde Ele foi crucificado (João 19:41). E antes desse sono, um soldado romano abriu o seu lado com uma lança,</w:t>
       </w:r>
       <w:r>
         <w:t xml:space="preserve"> </w:t>
@@ -3821,7 +3821,7 @@
         <w:pStyle w:val="BodyText"/>
       </w:pPr>
       <w:r>
-        <w:t xml:space="preserve">Jesus não ignorou o pecado. Mas cobriu a vergonha antes de tratar da culpa. E, algumas semanas depois, Ele mesmo seria pendurado nu numa cruz, diante de uma multidão que zombava. O autor de Hebreus diz que Ele</w:t>
+        <w:t xml:space="preserve">Jesus não ignorou o pecado. Mas cobriu a vergonha antes de tratar da culpa. E, alguns meses depois, Ele mesmo seria pendurado nu numa cruz, diante de uma multidão que zombava. O autor de Hebreus diz que Ele</w:t>
       </w:r>
       <w:r>
         <w:t xml:space="preserve"> </w:t>
@@ -4565,37 +4565,7 @@
         <w:t xml:space="preserve"> </w:t>
       </w:r>
       <w:r>
-        <w:t xml:space="preserve">(Oséias 11:8). Por meio de Isaías:</w:t>
-      </w:r>
-      <w:r>
-        <w:t xml:space="preserve"> </w:t>
-      </w:r>
-      <w:r>
-        <w:rPr>
-          <w:iCs/>
-          <w:i/>
-        </w:rPr>
-        <w:t xml:space="preserve">“</w:t>
-      </w:r>
-      <w:r>
-        <w:rPr>
-          <w:iCs/>
-          <w:i/>
-        </w:rPr>
-        <w:t xml:space="preserve">Busquei ser achado pelos que não perguntavam por mim</w:t>
-      </w:r>
-      <w:r>
-        <w:rPr>
-          <w:iCs/>
-          <w:i/>
-        </w:rPr>
-        <w:t xml:space="preserve">”</w:t>
-      </w:r>
-      <w:r>
-        <w:t xml:space="preserve"> </w:t>
-      </w:r>
-      <w:r>
-        <w:t xml:space="preserve">(Isaías 65:1).</w:t>
+        <w:t xml:space="preserve">(Oséias 11:8). Por meio de Isaías, Deus diz que se deixou achar até por quem nem perguntava por Ele (Isaías 65:1).</w:t>
       </w:r>
     </w:p>
     <w:p>
@@ -4991,62 +4961,62 @@
         <w:pStyle w:val="BodyText"/>
       </w:pPr>
       <w:r>
-        <w:t xml:space="preserve">Buscar. É o mesmo verbo de Gênesis 3. É o mesmo movimento do jardim. Jesus é Deus continuando aquela caminhada da tarde fresca, árvore por árvore, esconderijo por esconderijo, até encontrar cada filho perdido.</w:t>
-      </w:r>
-    </w:p>
-    <w:p>
-      <w:pPr>
-        <w:pStyle w:val="BodyText"/>
-      </w:pPr>
-      <w:r>
-        <w:t xml:space="preserve">E na parábola mais conhecida que contou, Jesus descreveu um pai que vê o filho voltar</w:t>
-      </w:r>
-      <w:r>
-        <w:t xml:space="preserve"> </w:t>
-      </w:r>
-      <w:r>
-        <w:rPr>
-          <w:iCs/>
-          <w:i/>
-        </w:rPr>
-        <w:t xml:space="preserve">“</w:t>
-      </w:r>
-      <w:r>
-        <w:rPr>
-          <w:iCs/>
-          <w:i/>
-        </w:rPr>
-        <w:t xml:space="preserve">quando ainda estava longe</w:t>
-      </w:r>
-      <w:r>
-        <w:rPr>
-          <w:iCs/>
-          <w:i/>
-        </w:rPr>
-        <w:t xml:space="preserve">”</w:t>
-      </w:r>
-      <w:r>
-        <w:t xml:space="preserve"> </w:t>
-      </w:r>
-      <w:r>
-        <w:t xml:space="preserve">e</w:t>
-      </w:r>
-      <w:r>
-        <w:t xml:space="preserve"> </w:t>
-      </w:r>
-      <w:r>
-        <w:rPr>
-          <w:iCs/>
-          <w:i/>
-        </w:rPr>
-        <w:t xml:space="preserve">“</w:t>
-      </w:r>
-      <w:r>
-        <w:rPr>
-          <w:iCs/>
-          <w:i/>
-        </w:rPr>
-        <w:t xml:space="preserve">correndo, o abraçou e beijou</w:t>
+        <w:t xml:space="preserve">Buscar. É o mesmo movimento de Gênesis 3, o mesmo do jardim. Jesus é Deus continuando aquela caminhada da tarde fresca, árvore por árvore, esconderijo por esconderijo, até encontrar cada filho perdido.</w:t>
+      </w:r>
+    </w:p>
+    <w:p>
+      <w:pPr>
+        <w:pStyle w:val="BodyText"/>
+      </w:pPr>
+      <w:r>
+        <w:t xml:space="preserve">E na parábola mais conhecida que contou, Jesus descreveu um pai que avista o filho quando este</w:t>
+      </w:r>
+      <w:r>
+        <w:t xml:space="preserve"> </w:t>
+      </w:r>
+      <w:r>
+        <w:rPr>
+          <w:iCs/>
+          <w:i/>
+        </w:rPr>
+        <w:t xml:space="preserve">“</w:t>
+      </w:r>
+      <w:r>
+        <w:rPr>
+          <w:iCs/>
+          <w:i/>
+        </w:rPr>
+        <w:t xml:space="preserve">vinha ainda longe</w:t>
+      </w:r>
+      <w:r>
+        <w:rPr>
+          <w:iCs/>
+          <w:i/>
+        </w:rPr>
+        <w:t xml:space="preserve">”</w:t>
+      </w:r>
+      <w:r>
+        <w:t xml:space="preserve"> </w:t>
+      </w:r>
+      <w:r>
+        <w:t xml:space="preserve">e,</w:t>
+      </w:r>
+      <w:r>
+        <w:t xml:space="preserve"> </w:t>
+      </w:r>
+      <w:r>
+        <w:rPr>
+          <w:iCs/>
+          <w:i/>
+        </w:rPr>
+        <w:t xml:space="preserve">“</w:t>
+      </w:r>
+      <w:r>
+        <w:rPr>
+          <w:iCs/>
+          <w:i/>
+        </w:rPr>
+        <w:t xml:space="preserve">correndo, o abraçou, e beijou</w:t>
       </w:r>
       <w:r>
         <w:rPr>
@@ -5572,15 +5542,15 @@
         <w:pStyle w:val="BodyText"/>
       </w:pPr>
       <w:r>
-        <w:t xml:space="preserve">Imagine como foi a noite seguinte entre os dois.</w:t>
-      </w:r>
-    </w:p>
-    <w:p>
-      <w:pPr>
-        <w:pStyle w:val="BodyText"/>
-      </w:pPr>
-      <w:r>
-        <w:t xml:space="preserve">Já vestidos com as peles que Deus faria, já fora do jardim, deitados lado a lado sob um céu que agora parecia mais frio. Eva acordada, olhando para o escuro. Lembrando da voz de Adão dizendo</w:t>
+        <w:t xml:space="preserve">Imagine como foram as noites seguintes entre os dois.</w:t>
+      </w:r>
+    </w:p>
+    <w:p>
+      <w:pPr>
+        <w:pStyle w:val="BodyText"/>
+      </w:pPr>
+      <w:r>
+        <w:t xml:space="preserve">Vestidos com as peles que Deus tinha feito, já fora do jardim, deitados lado a lado sob um céu que agora parecia mais frio. Eva acordada, olhando para o escuro. Lembrando da voz de Adão dizendo</w:t>
       </w:r>
       <w:r>
         <w:t xml:space="preserve"> </w:t>
@@ -6013,7 +5983,7 @@
         <w:pStyle w:val="BodyText"/>
       </w:pPr>
       <w:r>
-        <w:t xml:space="preserve">Talvez para o cônjuge, que não te entende. Para os pais, que erraram com você. Para o chefe, para o governo, para a igreja, para a infância difícil. Algumas dessas mágoas são reais e merecem cuidado. Mas talvez, no meio delas, exista uma parte que é sua e que você ainda não teve coragem de assumir.</w:t>
+        <w:t xml:space="preserve">Talvez para o cônjuge, que não entende você. Para os pais, que erraram com você. Para o chefe, para o governo, para a igreja, para a infância difícil. Algumas dessas mágoas são reais e merecem cuidado. Mas talvez, no meio delas, exista uma parte que é sua e que você ainda não teve coragem de assumir.</w:t>
       </w:r>
     </w:p>
     <w:p>
@@ -6489,7 +6459,7 @@
         <w:pStyle w:val="BodyText"/>
       </w:pPr>
       <w:r>
-        <w:t xml:space="preserve">Pela primeira vez nas Escrituras, sangue é derramado para cobrir o ser humano. É a semente de tudo o que viria depois. Abel ofereceria</w:t>
+        <w:t xml:space="preserve">O texto não descreve a morte do animal, mas a pressupõe: pela primeira vez nas Escrituras, uma vida é dada para cobrir o ser humano. É a semente de tudo o que viria depois. Abel ofereceria</w:t>
       </w:r>
       <w:r>
         <w:t xml:space="preserve"> </w:t>
@@ -6549,7 +6519,7 @@
         <w:t xml:space="preserve"> </w:t>
       </w:r>
       <w:r>
-        <w:t xml:space="preserve">(Gênesis 22:8). Israel pintaria os batentes das portas com sangue de cordeiro na noite da Páscoa (Êxodo 12:13). E a lei de Moisés estabeleceria que</w:t>
+        <w:t xml:space="preserve">(Gênesis 22:8). Israel pintaria os batentes das portas com sangue de cordeiro na noite da Páscoa (Êxodo 12:13). E a carta aos Hebreus resumiria toda a lei de Moisés dizendo que</w:t>
       </w:r>
       <w:r>
         <w:t xml:space="preserve"> </w:t>
@@ -8657,7 +8627,7 @@
         <w:pStyle w:val="BodyText"/>
       </w:pPr>
       <w:r>
-        <w:t xml:space="preserve">E depois disse as palavras que nenhum outro ser humano teria autoridade para dizer diante de um túmulo:</w:t>
+        <w:t xml:space="preserve">Pouco antes, tinha dito a Marta as palavras que nenhum outro ser humano teria autoridade para dizer diante de um túmulo:</w:t>
       </w:r>
       <w:r>
         <w:t xml:space="preserve"> </w:t>
@@ -9118,7 +9088,7 @@
         <w:t xml:space="preserve"> </w:t>
       </w:r>
       <w:r>
-        <w:t xml:space="preserve">(Gênesis 5:24). Um homem da sétima geração depois de Adão voltou a fazer o que Adão fazia no jardim: andar com Deus. Mesmo a leste do Éden, a comunhão era possível. Era um sinal de que a morte não teria a última palavra.</w:t>
+        <w:t xml:space="preserve">(Gênesis 5:24). Um homem que era o sétimo a partir de Adão (Judas 14) voltou a fazer o que Adão fazia no jardim: andar com Deus. Mesmo a leste do Éden, a comunhão era possível. Era um sinal de que a morte não teria a última palavra.</w:t>
       </w:r>
     </w:p>
     <w:p>
@@ -9490,7 +9460,7 @@
           <w:iCs/>
           <w:i/>
         </w:rPr>
-        <w:t xml:space="preserve">E lhe enxugará dos olhos toda lágrima, e a morte já não existirá</w:t>
+        <w:t xml:space="preserve">E lhes enxugará dos olhos toda lágrima, e a morte já não existirá</w:t>
       </w:r>
       <w:r>
         <w:rPr>
@@ -9600,6 +9570,54 @@
         <w:pStyle w:val="BodyText"/>
       </w:pPr>
       <w:r>
+        <w:t xml:space="preserve">Pense no que Adão poderia ter feito com os seus novecentos e trinta anos. Poderia ter passado todos eles olhando para trás, remoendo a tarde do fruto, repetindo para si mesmo que tinha estragado tudo. Teria sido compreensível. Ninguém na história teve mais motivo para viver preso ao passado.</w:t>
+      </w:r>
+    </w:p>
+    <w:p>
+      <w:pPr>
+        <w:pStyle w:val="BodyText"/>
+      </w:pPr>
+      <w:r>
+        <w:t xml:space="preserve">Mas a frase de Gênesis 4:26 sugere outro caminho. Na casa de Adão, os filhos e os netos aprenderam a invocar o nome do Senhor. Alguém, ali, decidiu que a última palavra sobre aquela família não seria a queda, mas a oração. Alguém escolheu olhar para a frente, para a promessa, em vez de olhar só para trás, para a perda.</w:t>
+      </w:r>
+    </w:p>
+    <w:p>
+      <w:pPr>
+        <w:pStyle w:val="BodyText"/>
+      </w:pPr>
+      <w:r>
+        <w:t xml:space="preserve">Você também pode fazer essa escolha. Não precisa fingir que o passado não aconteceu. Adão nunca esqueceu o jardim, e você também não vai esquecer o que viveu. Mas pode decidir que a sua história não vai ser contada apenas pelas suas quedas. Pode decidir que, na sua casa, alguém vai invocar o nome do Senhor.</w:t>
+      </w:r>
+    </w:p>
+    <w:p>
+      <w:pPr>
+        <w:pStyle w:val="BodyText"/>
+      </w:pPr>
+      <w:r>
+        <w:t xml:space="preserve">Às vezes isso começa de um jeito muito simples. Uma oração antes do almoço. Um versículo lido em voz alta à noite. Uma conversa com um filho, um neto, um amigo mais novo, em que você conta não só os seus erros, mas também a graça que encontrou depois deles. A fé que atravessou as gerações de Adão até Noé não passou por discursos grandiosos. Passou por casas comuns, por gente comum, que se lembrava de chamar por Deus.</w:t>
+      </w:r>
+    </w:p>
+    <w:p>
+      <w:pPr>
+        <w:pStyle w:val="BodyText"/>
+      </w:pPr>
+      <w:r>
+        <w:t xml:space="preserve">E o mais bonito é que o tempo que ainda lhe resta, seja ele curto ou longo, cabe inteiro na paciência de Deus. Não é tarde demais para começar. Adão tinha mais de cem anos quando Sete nasceu, e mais de duzentos quando Enos veio ao mundo. A história de graça daquela família começou a florescer quando ele já era velho.</w:t>
+      </w:r>
+    </w:p>
+    <w:p>
+      <w:pPr>
+        <w:pStyle w:val="BodyText"/>
+      </w:pPr>
+      <w:r>
+        <w:t xml:space="preserve">Deus não mede a sua vida pelos anos que você perdeu. Ele a mede pela promessa que cumpriu em Jesus.</w:t>
+      </w:r>
+    </w:p>
+    <w:p>
+      <w:pPr>
+        <w:pStyle w:val="BodyText"/>
+      </w:pPr>
+      <w:r>
         <w:t xml:space="preserve">E se, como Adão, você tiver alguém sentado no seu colo, ou na sua mesa, ou na sua vida, perguntando</w:t>
       </w:r>
       <w:r>
@@ -9704,15 +9722,15 @@
         <w:pStyle w:val="BodyText"/>
       </w:pPr>
       <w:r>
-        <w:t xml:space="preserve">Se você ainda está se escondendo, tudo bem. Não vou te apressar. Deus também não. Mas quero te pedir uma coisa pequena: não se acostume com o esconderijo. Não ache que é ali que você mora. Você foi feito para andar ao ar livre, na viração do dia, com o rosto descoberto.</w:t>
-      </w:r>
-    </w:p>
-    <w:p>
-      <w:pPr>
-        <w:pStyle w:val="BodyText"/>
-      </w:pPr>
-      <w:r>
-        <w:t xml:space="preserve">E se você já saiu de trás da árvore, se já foi vestido por Ele, então te peço outra coisa: seja paciente com quem ainda está escondido. Você sabe como é. Chame com a mesma voz mansa que te chamou.</w:t>
+        <w:t xml:space="preserve">Se você ainda está se escondendo, tudo bem. Não vou apressar você. Deus também não. Mas quero lhe pedir uma coisa pequena: não se acostume com o esconderijo. Não ache que é ali que você mora. Você foi feito para andar ao ar livre, na viração do dia, com o rosto descoberto.</w:t>
+      </w:r>
+    </w:p>
+    <w:p>
+      <w:pPr>
+        <w:pStyle w:val="BodyText"/>
+      </w:pPr>
+      <w:r>
+        <w:t xml:space="preserve">E se você já saiu de trás da árvore, se já foi vestido por Ele, então lhe peço outra coisa: seja paciente com quem ainda está escondido. Você sabe como é. Chame com a mesma voz mansa que chamou você.</w:t>
       </w:r>
     </w:p>
     <w:p>
@@ -10156,12 +10174,6 @@
       <w:r>
         <w:t xml:space="preserve">Gênesis 22:8 — Deus proverá o cordeiro</w:t>
       </w:r>
-      <w:r>
-        <w:t xml:space="preserve"> </w:t>
-      </w:r>
-      <w:r>
-        <w:t xml:space="preserve">Êxodo 12:13; 26:31 — o sangue da Páscoa; o véu com querubins</w:t>
-      </w:r>
     </w:p>
     <w:p>
       <w:pPr>
@@ -10172,7 +10184,7 @@
         <w:pStyle w:val="Compact"/>
       </w:pPr>
       <w:r>
-        <w:t xml:space="preserve">2 Samuel 18:33 — o luto de Davi por Absalão</w:t>
+        <w:t xml:space="preserve">Êxodo 12:13; 26:31 — o sangue da Páscoa; o véu com querubins</w:t>
       </w:r>
     </w:p>
     <w:p>
@@ -10184,7 +10196,7 @@
         <w:pStyle w:val="Compact"/>
       </w:pPr>
       <w:r>
-        <w:t xml:space="preserve">Jó 33:4 — o sopro do Todo-Poderoso dá vida</w:t>
+        <w:t xml:space="preserve">2 Samuel 18:33 — o luto de Davi por Absalão</w:t>
       </w:r>
     </w:p>
     <w:p>
@@ -10196,7 +10208,7 @@
         <w:pStyle w:val="Compact"/>
       </w:pPr>
       <w:r>
-        <w:t xml:space="preserve">Salmos 8:4-5; 32:3-5; 34:18; 42:1-2; 119:11; 124:8; 139:7-8 — a dignidade humana, a confissão, a sede de Deus, a proximidade de Deus</w:t>
+        <w:t xml:space="preserve">Jó 33:4 — o sopro do Todo-Poderoso dá vida</w:t>
       </w:r>
     </w:p>
     <w:p>
@@ -10208,7 +10220,7 @@
         <w:pStyle w:val="Compact"/>
       </w:pPr>
       <w:r>
-        <w:t xml:space="preserve">Provérbios 28:13 — confessar e alcançar misericórdia</w:t>
+        <w:t xml:space="preserve">Salmos 8:4-5; 32:3-5; 34:18; 42:1-2; 119:11; 124:8; 139:7-8 — a dignidade humana, a confissão, a sede de Deus, a proximidade de Deus</w:t>
       </w:r>
     </w:p>
     <w:p>
@@ -10220,7 +10232,7 @@
         <w:pStyle w:val="Compact"/>
       </w:pPr>
       <w:r>
-        <w:t xml:space="preserve">Eclesiastes 4:9-10 — melhor serem dois do que um</w:t>
+        <w:t xml:space="preserve">Provérbios 28:13 — confessar e alcançar misericórdia</w:t>
       </w:r>
     </w:p>
     <w:p>
@@ -10232,7 +10244,7 @@
         <w:pStyle w:val="Compact"/>
       </w:pPr>
       <w:r>
-        <w:t xml:space="preserve">Isaías 30:18; 53:7; 61:10; 64:6, 8; 65:1 — o Deus que espera, o Servo sofredor, as vestes de salvação, o Oleiro</w:t>
+        <w:t xml:space="preserve">Eclesiastes 4:9-10 — melhor serem dois do que um</w:t>
       </w:r>
     </w:p>
     <w:p>
@@ -10244,7 +10256,7 @@
         <w:pStyle w:val="Compact"/>
       </w:pPr>
       <w:r>
-        <w:t xml:space="preserve">Jeremias 6:14; 29:11 — a cura superficial; pensamentos de paz</w:t>
+        <w:t xml:space="preserve">Isaías 30:18; 53:7; 61:10; 64:6, 8; 65:1 — o Deus que espera, o Servo sofredor, as vestes de salvação, o Oleiro</w:t>
       </w:r>
     </w:p>
     <w:p>
@@ -10256,7 +10268,7 @@
         <w:pStyle w:val="Compact"/>
       </w:pPr>
       <w:r>
-        <w:t xml:space="preserve">Ezequiel 34:11 — Deus procura as suas ovelhas</w:t>
+        <w:t xml:space="preserve">Jeremias 6:14; 29:11 — a cura superficial; pensamentos de paz</w:t>
       </w:r>
     </w:p>
     <w:p>
@@ -10268,7 +10280,7 @@
         <w:pStyle w:val="Compact"/>
       </w:pPr>
       <w:r>
-        <w:t xml:space="preserve">Lamentações 3:22-23 — misericórdias que se renovam cada manhã</w:t>
+        <w:t xml:space="preserve">Ezequiel 34:11 — Deus procura as suas ovelhas</w:t>
       </w:r>
     </w:p>
     <w:p>
@@ -10280,7 +10292,7 @@
         <w:pStyle w:val="Compact"/>
       </w:pPr>
       <w:r>
-        <w:t xml:space="preserve">Oséias 11:8 — o coração comovido de Deus</w:t>
+        <w:t xml:space="preserve">Lamentações 3:22-23 — misericórdias que se renovam cada manhã</w:t>
       </w:r>
     </w:p>
     <w:p>
@@ -10292,7 +10304,7 @@
         <w:pStyle w:val="Compact"/>
       </w:pPr>
       <w:r>
-        <w:t xml:space="preserve">Mateus 4:3-4; 11:28; 27:46, 51; 28:20 — a tentação de Jesus, o descanso, a cruz, o véu rasgado, a presença</w:t>
+        <w:t xml:space="preserve">Oséias 11:8 — o coração comovido de Deus</w:t>
       </w:r>
     </w:p>
     <w:p>
@@ -10304,7 +10316,7 @@
         <w:pStyle w:val="Compact"/>
       </w:pPr>
       <w:r>
-        <w:t xml:space="preserve">Lucas 15:4-8, 20; 19:5, 10; 23:34 — a ovelha, a moeda, o pai que corre, Zaqueu, o perdão na cruz</w:t>
+        <w:t xml:space="preserve">Mateus 4:3-4; 11:28; 27:46, 51; 28:20 — a tentação de Jesus, o descanso, a cruz, o véu rasgado, a presença</w:t>
       </w:r>
     </w:p>
     <w:p>
@@ -10316,7 +10328,7 @@
         <w:pStyle w:val="Compact"/>
       </w:pPr>
       <w:r>
-        <w:t xml:space="preserve">João 1:29; 8:6-11, 44; 11:25, 35; 14:6; 15:4; 19:2, 23-24, 34; 20:22 — o Cordeiro de Deus e os sinais do último Adão</w:t>
+        <w:t xml:space="preserve">Lucas 15:4-8, 20; 19:5, 10; 23:34 — a ovelha, a moeda, o pai que corre, Zaqueu, o perdão na cruz</w:t>
       </w:r>
     </w:p>
     <w:p>
@@ -10328,7 +10340,7 @@
         <w:pStyle w:val="Compact"/>
       </w:pPr>
       <w:r>
-        <w:t xml:space="preserve">Romanos 3:23; 5:12, 19; 8:1, 22, 32 — o pecado, a obediência de Cristo, nenhuma condenação, a criação que geme</w:t>
+        <w:t xml:space="preserve">João 1:29; 8:6-11, 44; 11:25, 35; 14:6; 15:4; 19:2, 23-24, 34, 41; 20:22 — o Cordeiro de Deus e os sinais do último Adão</w:t>
       </w:r>
     </w:p>
     <w:p>
@@ -10340,7 +10352,7 @@
         <w:pStyle w:val="Compact"/>
       </w:pPr>
       <w:r>
-        <w:t xml:space="preserve">1 Coríntios 10:13; 15:22, 45 — o livramento na tentação; o último Adão</w:t>
+        <w:t xml:space="preserve">Romanos 3:23; 5:12, 19; 8:1, 22, 32 — o pecado, a obediência de Cristo, nenhuma condenação, a criação que geme</w:t>
       </w:r>
     </w:p>
     <w:p>
@@ -10352,7 +10364,7 @@
         <w:pStyle w:val="Compact"/>
       </w:pPr>
       <w:r>
-        <w:t xml:space="preserve">2 Coríntios 5:17, 21; 11:3 — nova criatura; a troca na cruz</w:t>
+        <w:t xml:space="preserve">1 Coríntios 10:13; 15:22, 45 — o livramento na tentação; o último Adão</w:t>
       </w:r>
     </w:p>
     <w:p>
@@ -10364,7 +10376,7 @@
         <w:pStyle w:val="Compact"/>
       </w:pPr>
       <w:r>
-        <w:t xml:space="preserve">Gálatas 3:27 — revestidos de Cristo</w:t>
+        <w:t xml:space="preserve">2 Coríntios 5:17, 21; 11:3 — nova criatura; a troca na cruz</w:t>
       </w:r>
     </w:p>
     <w:p>
@@ -10376,7 +10388,7 @@
         <w:pStyle w:val="Compact"/>
       </w:pPr>
       <w:r>
-        <w:t xml:space="preserve">Efésios 5:25 — Cristo amou a igreja</w:t>
+        <w:t xml:space="preserve">Gálatas 3:27 — revestidos de Cristo</w:t>
       </w:r>
     </w:p>
     <w:p>
@@ -10388,7 +10400,7 @@
         <w:pStyle w:val="Compact"/>
       </w:pPr>
       <w:r>
-        <w:t xml:space="preserve">Colossenses 3:12 — revestidos como eleitos, santos e amados</w:t>
+        <w:t xml:space="preserve">Efésios 5:25 — Cristo amou a igreja</w:t>
       </w:r>
     </w:p>
     <w:p>
@@ -10400,7 +10412,7 @@
         <w:pStyle w:val="Compact"/>
       </w:pPr>
       <w:r>
-        <w:t xml:space="preserve">1 Tessalonicenses 4:13 — a tristeza com esperança</w:t>
+        <w:t xml:space="preserve">Colossenses 3:12 — revestidos como eleitos, santos e amados</w:t>
       </w:r>
     </w:p>
     <w:p>
@@ -10412,7 +10424,7 @@
         <w:pStyle w:val="Compact"/>
       </w:pPr>
       <w:r>
-        <w:t xml:space="preserve">1 Timóteo 1:16 — a completa longanimidade de Cristo</w:t>
+        <w:t xml:space="preserve">1 Tessalonicenses 4:13 — a tristeza com esperança</w:t>
       </w:r>
     </w:p>
     <w:p>
@@ -10424,7 +10436,7 @@
         <w:pStyle w:val="Compact"/>
       </w:pPr>
       <w:r>
-        <w:t xml:space="preserve">Hebreus 2:14; 4:15; 9:22; 10:19-20; 11:13; 12:2, 24 — o Sumo Sacerdote, o novo e vivo caminho, os que morreram na fé, o sangue que fala</w:t>
+        <w:t xml:space="preserve">1 Timóteo 1:16 — a completa longanimidade de Cristo</w:t>
       </w:r>
     </w:p>
     <w:p>
@@ -10436,7 +10448,7 @@
         <w:pStyle w:val="Compact"/>
       </w:pPr>
       <w:r>
-        <w:t xml:space="preserve">Tiago 1:14-15 — como a tentação concebe o pecado</w:t>
+        <w:t xml:space="preserve">Hebreus 2:14; 4:15; 9:22; 10:19-20; 11:13; 12:2, 24 — o Sumo Sacerdote, o novo e vivo caminho, os que morreram na fé, o sangue que fala</w:t>
       </w:r>
     </w:p>
     <w:p>
@@ -10448,7 +10460,7 @@
         <w:pStyle w:val="Compact"/>
       </w:pPr>
       <w:r>
-        <w:t xml:space="preserve">2 Pedro 3:9 — a paciência do Senhor</w:t>
+        <w:t xml:space="preserve">Tiago 1:14-15 — como a tentação concebe o pecado</w:t>
       </w:r>
     </w:p>
     <w:p>
@@ -10460,7 +10472,31 @@
         <w:pStyle w:val="Compact"/>
       </w:pPr>
       <w:r>
+        <w:t xml:space="preserve">2 Pedro 3:9 — a paciência do Senhor</w:t>
+      </w:r>
+    </w:p>
+    <w:p>
+      <w:pPr>
+        <w:numPr>
+          <w:ilvl w:val="0"/>
+          <w:numId w:val="1001"/>
+        </w:numPr>
+        <w:pStyle w:val="Compact"/>
+      </w:pPr>
+      <w:r>
         <w:t xml:space="preserve">1 João 1:8-9 — a confissão e o perdão</w:t>
+      </w:r>
+    </w:p>
+    <w:p>
+      <w:pPr>
+        <w:numPr>
+          <w:ilvl w:val="0"/>
+          <w:numId w:val="1001"/>
+        </w:numPr>
+        <w:pStyle w:val="Compact"/>
+      </w:pPr>
+      <w:r>
+        <w:t xml:space="preserve">Judas 14 — Enoque, o sétimo a partir de Adão</w:t>
       </w:r>
     </w:p>
     <w:p>

</xml_diff>